<commit_message>
fix(delivery): 结果页接通 partial/cancelled 终态 + Word/清单校准 + 最终提交包
- 结果页 TaskResultClient：isDone 加 partial/cancelled；status 仅 running/queued 显示生成中，partial/cancelled 展示已生成产物（审计缺口1）
- 前端类型扩展 TaskDetail.status 含 partial/cancelled（tsc 0 error）
- 正式提交 Word 校准：Next.js 14→15、处理完即弃→持久化、百炼→TokenDance/Seedream、90秒加测试样本限定
- FINAL-DELIVERY 加端到端完整流程证据（mock 双平台 partial 闸门实证 + 单平台 done）+ 公网 SCF 同步超时如实标注
- 生成 submission/final-submission.zip 最终提交整合包
</commit_message>
<xml_diff>
--- a/submission/SimonStudio_千岸QianAn_复赛作品.docx
+++ b/submission/SimonStudio_千岸QianAn_复赛作品.docx
@@ -1302,7 +1302,7 @@
           <w:rFonts w:hint="eastAsia"/>
           <w:b w:val="1"/>
         </w:rPr>
-        <w:t>核心使用链路（约 90 秒一键铺全球）：</w:t>
+        <w:t>核心使用链路（约 90 秒（基于单商品测试样本，非普遍保证）一键铺全球）：</w:t>
       </w:r>
     </w:p>
     <w:p>
@@ -1921,7 +1921,7 @@
         <w:rPr>
           <w:rFonts w:hint="eastAsia"/>
         </w:rPr>
-        <w:t>架构天然支持横向扩展——新增平台只需补充规则库 JSON（无需改代码），新增语言只需接入对应百炼多语言模型。规则引擎 + Agent 编排的设计让系统具备自演进能力：新教训通过反思自动回写记忆库，跨任务学习让系统越用越聪明。</w:t>
+        <w:t>架构天然支持横向扩展——新增平台只需补充规则库 JSON（无需改代码），新增语言只需接入对应多语言模型。规则引擎 + Agent 编排的设计让系统具备自演进能力：新教训通过反思自动回写记忆库，跨任务学习让系统越用越聪明。</w:t>
       </w:r>
     </w:p>
     <w:p>
@@ -1966,7 +1966,7 @@
         <w:rPr>
           <w:rFonts w:hint="eastAsia"/>
         </w:rPr>
-        <w:t>千岸（QianAn）是一款面向跨境卖家的 AI 智能上新 Agent，解决一个新品铺到多个海外平台时素材生产耗时耗钱的痛点。卖家只需上传一张白底主图 + 一段中文卖点，千岸在约 90 秒内自动产出 Amazon、Shopee、AliExpress、Lazada、TikTok Shop 五个平台各自符合规范的上架包（Listing 文案 + 合规主图 + 详情页/A+）。核心差异化在于多平台规则引擎（不是简单生成，而是规则感知的本地化重排）和设计师级视觉规范，让中小卖家也能像大卖一样一键铺全球。</w:t>
+        <w:t>千岸（QianAn）是一款面向跨境卖家的 AI 智能上新 Agent，解决一个新品铺到多个海外平台时素材生产耗时耗钱的痛点。卖家只需上传一张白底主图 + 一段中文卖点，千岸在约 90 秒（基于单商品测试样本，非普遍保证）内自动产出 Amazon、Shopee、AliExpress、Lazada、TikTok Shop 五个平台各自符合规范的上架包（Listing 文案 + 合规主图 + 详情页/A+）。核心差异化在于多平台规则引擎（不是简单生成，而是规则感知的本地化重排）和设计师级视觉规范，让中小卖家也能像大卖一样一键铺全球。</w:t>
       </w:r>
     </w:p>
     <w:p>
@@ -2109,7 +2109,7 @@
         <w:rPr>
           <w:rFonts w:hint="eastAsia"/>
         </w:rPr>
-        <w:t>4. 等待约 90 秒，右侧轨迹面板实时显示 Agent 决策过程（规划/工具调用/记忆召回/反思）</w:t>
+        <w:t>4. 等待约 90 秒（基于单商品测试样本，非普遍保证），右侧轨迹面板实时显示 Agent 决策过程（规划/工具调用/记忆召回/反思）</w:t>
       </w:r>
     </w:p>
     <w:p>
@@ -2333,7 +2333,7 @@
         <w:rPr>
           <w:rFonts w:hint="eastAsia"/>
         </w:rPr>
-        <w:t>：Next.js 14 + TypeScript + Tailwind/shadcn，Agent 能力证据面板（AgentCapabilityPanel.tsx）渲染四栏结构化证据</w:t>
+        <w:t>：Next.js 15 + TypeScript + Tailwind/shadcn，Agent 能力证据面板（AgentCapabilityPanel.tsx）渲染四栏结构化证据</w:t>
       </w:r>
     </w:p>
     <w:p>
@@ -2351,7 +2351,7 @@
         <w:rPr>
           <w:rFonts w:hint="eastAsia"/>
         </w:rPr>
-        <w:t>：腾讯云 CloudBase（云函数 + 静态托管），阿里云百炼平台提供算力支持</w:t>
+        <w:t>：腾讯云 CloudBase（云函数 + 静态托管），阿里云百炼（文案 / 视觉理解）+ TokenDance 网关（字节 Seedream 文生图）提供算力支持</w:t>
       </w:r>
     </w:p>
     <w:p>
@@ -2982,7 +2982,7 @@
         <w:rPr>
           <w:rFonts w:hint="eastAsia"/>
         </w:rPr>
-        <w:t>输入为卖家自有商品图 + 卖点文本（无需爬取平台数据，合规干净）；平台规则库人工整理 + LLM 辅助提取，存为结构化 JSON；不留存卖家数据，处理完即弃。</w:t>
+        <w:t>输入为卖家自有商品图 + 卖点文本（无需爬取平台数据，合规干净）；平台规则库人工整理 + LLM 辅助提取，存为结构化 JSON；处理结果持久化落盘（task.json / export.json 与产物本地保存），不主动外传卖家数据。</w:t>
       </w:r>
     </w:p>
     <w:p>
@@ -3057,7 +3057,7 @@
         <w:rPr>
           <w:rFonts w:hint="eastAsia"/>
         </w:rPr>
-        <w:t>（9.1-9.5）：FastAPI 后端 ~40 端点 + Next.js 前端 + 5 平台规则库 + 真实 AI 生成链路（qwen3.7-max 文案 + seedream 图像 + qwen3-vl-plus 视觉）</w:t>
+        <w:t>（9.1-9.5）：FastAPI 后端 ~40 端点 + Next.js 前端 + 5 平台规则库 + 真实 AI 生成链路（qwen3.7-max 文案 + Seedream 文生图（经 TokenDance 网关，非百炼 Wanx） + qwen3-vl-plus 视觉）</w:t>
       </w:r>
     </w:p>
     <w:p>

</xml_diff>